<commit_message>
Update Claude Code Commands doc
Co-Authored-By: Claude Sonnet 4.6 <noreply@anthropic.com>
</commit_message>
<xml_diff>
--- a/Claude Code Commands.docx
+++ b/Claude Code Commands.docx
@@ -463,6 +463,455 @@
     </w:p>
     <w:p>
       <w:pPr>
+        <w:pBdr>
+          <w:bottom w:val="single" w:sz="12" w:space="1" w:color="auto"/>
+        </w:pBdr>
+        <w:rPr>
+          <w:b/>
+          <w:bCs/>
+          <w:lang w:val="en-US"/>
+        </w:rPr>
+      </w:pPr>
+      <w:r>
+        <w:rPr>
+          <w:b/>
+          <w:bCs/>
+          <w:lang w:val="en-US"/>
+        </w:rPr>
+        <w:t>The Big Picture</w:t>
+      </w:r>
+    </w:p>
+    <w:p>
+      <w:pPr>
+        <w:pBdr>
+          <w:bottom w:val="single" w:sz="12" w:space="1" w:color="auto"/>
+        </w:pBdr>
+        <w:rPr>
+          <w:b/>
+          <w:bCs/>
+          <w:lang w:val="en-US"/>
+        </w:rPr>
+      </w:pPr>
+    </w:p>
+    <w:p>
+      <w:pPr>
+        <w:pBdr>
+          <w:bottom w:val="single" w:sz="12" w:space="1" w:color="auto"/>
+        </w:pBdr>
+        <w:rPr>
+          <w:b/>
+          <w:bCs/>
+          <w:lang w:val="en-US"/>
+        </w:rPr>
+      </w:pPr>
+      <w:r>
+        <w:rPr>
+          <w:b/>
+          <w:bCs/>
+          <w:lang w:val="en-US"/>
+        </w:rPr>
+        <w:t xml:space="preserve">  Here's the full flow in one diagram:</w:t>
+      </w:r>
+    </w:p>
+    <w:p>
+      <w:pPr>
+        <w:pBdr>
+          <w:bottom w:val="single" w:sz="12" w:space="1" w:color="auto"/>
+        </w:pBdr>
+        <w:rPr>
+          <w:b/>
+          <w:bCs/>
+          <w:lang w:val="en-US"/>
+        </w:rPr>
+      </w:pPr>
+    </w:p>
+    <w:p>
+      <w:pPr>
+        <w:pBdr>
+          <w:bottom w:val="single" w:sz="12" w:space="1" w:color="auto"/>
+        </w:pBdr>
+        <w:rPr>
+          <w:b/>
+          <w:bCs/>
+          <w:lang w:val="en-US"/>
+        </w:rPr>
+      </w:pPr>
+      <w:r>
+        <w:rPr>
+          <w:b/>
+          <w:bCs/>
+          <w:lang w:val="en-US"/>
+        </w:rPr>
+        <w:t xml:space="preserve">  Your files</w:t>
+      </w:r>
+    </w:p>
+    <w:p>
+      <w:pPr>
+        <w:pBdr>
+          <w:bottom w:val="single" w:sz="12" w:space="1" w:color="auto"/>
+        </w:pBdr>
+        <w:rPr>
+          <w:b/>
+          <w:bCs/>
+          <w:lang w:val="en-US"/>
+        </w:rPr>
+      </w:pPr>
+      <w:r>
+        <w:rPr>
+          <w:b/>
+          <w:bCs/>
+          <w:lang w:val="en-US"/>
+        </w:rPr>
+        <w:t xml:space="preserve">      │</w:t>
+      </w:r>
+    </w:p>
+    <w:p>
+      <w:pPr>
+        <w:pBdr>
+          <w:bottom w:val="single" w:sz="12" w:space="1" w:color="auto"/>
+        </w:pBdr>
+        <w:rPr>
+          <w:b/>
+          <w:bCs/>
+          <w:lang w:val="en-US"/>
+        </w:rPr>
+      </w:pPr>
+      <w:r>
+        <w:rPr>
+          <w:b/>
+          <w:bCs/>
+          <w:lang w:val="en-US"/>
+        </w:rPr>
+        <w:t xml:space="preserve">      </w:t>
+      </w:r>
+      <w:r>
+        <w:rPr>
+          <w:rFonts w:ascii="Arial" w:hAnsi="Arial" w:cs="Arial"/>
+          <w:b/>
+          <w:bCs/>
+          <w:lang w:val="en-US"/>
+        </w:rPr>
+        <w:t>▼</w:t>
+      </w:r>
+    </w:p>
+    <w:p>
+      <w:pPr>
+        <w:pBdr>
+          <w:bottom w:val="single" w:sz="12" w:space="1" w:color="auto"/>
+        </w:pBdr>
+        <w:rPr>
+          <w:b/>
+          <w:bCs/>
+          <w:lang w:val="en-US"/>
+        </w:rPr>
+      </w:pPr>
+      <w:r>
+        <w:rPr>
+          <w:b/>
+          <w:bCs/>
+          <w:lang w:val="en-US"/>
+        </w:rPr>
+        <w:t xml:space="preserve">  git add        → Staging area (what you WANT to commit)</w:t>
+      </w:r>
+    </w:p>
+    <w:p>
+      <w:pPr>
+        <w:pBdr>
+          <w:bottom w:val="single" w:sz="12" w:space="1" w:color="auto"/>
+        </w:pBdr>
+        <w:rPr>
+          <w:b/>
+          <w:bCs/>
+          <w:lang w:val="en-US"/>
+        </w:rPr>
+      </w:pPr>
+      <w:r>
+        <w:rPr>
+          <w:b/>
+          <w:bCs/>
+          <w:lang w:val="en-US"/>
+        </w:rPr>
+        <w:t xml:space="preserve">      │</w:t>
+      </w:r>
+    </w:p>
+    <w:p>
+      <w:pPr>
+        <w:pBdr>
+          <w:bottom w:val="single" w:sz="12" w:space="1" w:color="auto"/>
+        </w:pBdr>
+        <w:rPr>
+          <w:b/>
+          <w:bCs/>
+          <w:lang w:val="en-US"/>
+        </w:rPr>
+      </w:pPr>
+      <w:r>
+        <w:rPr>
+          <w:b/>
+          <w:bCs/>
+          <w:lang w:val="en-US"/>
+        </w:rPr>
+        <w:t xml:space="preserve">      </w:t>
+      </w:r>
+      <w:r>
+        <w:rPr>
+          <w:rFonts w:ascii="Arial" w:hAnsi="Arial" w:cs="Arial"/>
+          <w:b/>
+          <w:bCs/>
+          <w:lang w:val="en-US"/>
+        </w:rPr>
+        <w:t>▼</w:t>
+      </w:r>
+    </w:p>
+    <w:p>
+      <w:pPr>
+        <w:pBdr>
+          <w:bottom w:val="single" w:sz="12" w:space="1" w:color="auto"/>
+        </w:pBdr>
+        <w:rPr>
+          <w:b/>
+          <w:bCs/>
+          <w:lang w:val="en-US"/>
+        </w:rPr>
+      </w:pPr>
+      <w:r>
+        <w:rPr>
+          <w:b/>
+          <w:bCs/>
+          <w:lang w:val="en-US"/>
+        </w:rPr>
+        <w:t xml:space="preserve">  git commit     → </w:t>
+      </w:r>
+      <w:proofErr w:type="gramStart"/>
+      <w:r>
+        <w:rPr>
+          <w:b/>
+          <w:bCs/>
+          <w:lang w:val="en-US"/>
+        </w:rPr>
+        <w:t>Local .git</w:t>
+      </w:r>
+      <w:proofErr w:type="gramEnd"/>
+      <w:r>
+        <w:rPr>
+          <w:b/>
+          <w:bCs/>
+          <w:lang w:val="en-US"/>
+        </w:rPr>
+        <w:t xml:space="preserve"> history (permanent snapshot)</w:t>
+      </w:r>
+    </w:p>
+    <w:p>
+      <w:pPr>
+        <w:pBdr>
+          <w:bottom w:val="single" w:sz="12" w:space="1" w:color="auto"/>
+        </w:pBdr>
+        <w:rPr>
+          <w:b/>
+          <w:bCs/>
+          <w:lang w:val="en-US"/>
+        </w:rPr>
+      </w:pPr>
+      <w:r>
+        <w:rPr>
+          <w:b/>
+          <w:bCs/>
+          <w:lang w:val="en-US"/>
+        </w:rPr>
+        <w:t xml:space="preserve">      │</w:t>
+      </w:r>
+    </w:p>
+    <w:p>
+      <w:pPr>
+        <w:pBdr>
+          <w:bottom w:val="single" w:sz="12" w:space="1" w:color="auto"/>
+        </w:pBdr>
+        <w:rPr>
+          <w:b/>
+          <w:bCs/>
+          <w:lang w:val="en-US"/>
+        </w:rPr>
+      </w:pPr>
+      <w:r>
+        <w:rPr>
+          <w:b/>
+          <w:bCs/>
+          <w:lang w:val="en-US"/>
+        </w:rPr>
+        <w:t xml:space="preserve">      </w:t>
+      </w:r>
+      <w:r>
+        <w:rPr>
+          <w:rFonts w:ascii="Arial" w:hAnsi="Arial" w:cs="Arial"/>
+          <w:b/>
+          <w:bCs/>
+          <w:lang w:val="en-US"/>
+        </w:rPr>
+        <w:t>▼</w:t>
+      </w:r>
+    </w:p>
+    <w:p>
+      <w:pPr>
+        <w:pBdr>
+          <w:bottom w:val="single" w:sz="12" w:space="1" w:color="auto"/>
+        </w:pBdr>
+        <w:rPr>
+          <w:b/>
+          <w:bCs/>
+          <w:lang w:val="en-US"/>
+        </w:rPr>
+      </w:pPr>
+      <w:r>
+        <w:rPr>
+          <w:b/>
+          <w:bCs/>
+          <w:lang w:val="en-US"/>
+        </w:rPr>
+        <w:t xml:space="preserve">  git push       → GitHub (shared, backed up, visible to others)</w:t>
+      </w:r>
+    </w:p>
+    <w:p>
+      <w:pPr>
+        <w:pBdr>
+          <w:bottom w:val="single" w:sz="12" w:space="1" w:color="auto"/>
+        </w:pBdr>
+        <w:rPr>
+          <w:b/>
+          <w:bCs/>
+          <w:lang w:val="en-US"/>
+        </w:rPr>
+      </w:pPr>
+      <w:r>
+        <w:rPr>
+          <w:b/>
+          <w:bCs/>
+          <w:lang w:val="en-US"/>
+        </w:rPr>
+        <w:t xml:space="preserve">  Going forward, your day-to-day workflow for this project will</w:t>
+      </w:r>
+    </w:p>
+    <w:p>
+      <w:pPr>
+        <w:pBdr>
+          <w:bottom w:val="single" w:sz="12" w:space="1" w:color="auto"/>
+        </w:pBdr>
+        <w:rPr>
+          <w:b/>
+          <w:bCs/>
+          <w:lang w:val="en-US"/>
+        </w:rPr>
+      </w:pPr>
+      <w:r>
+        <w:rPr>
+          <w:b/>
+          <w:bCs/>
+          <w:lang w:val="en-US"/>
+        </w:rPr>
+        <w:t xml:space="preserve">  just be:</w:t>
+      </w:r>
+    </w:p>
+    <w:p>
+      <w:pPr>
+        <w:pBdr>
+          <w:bottom w:val="single" w:sz="12" w:space="1" w:color="auto"/>
+        </w:pBdr>
+        <w:rPr>
+          <w:b/>
+          <w:bCs/>
+          <w:lang w:val="en-US"/>
+        </w:rPr>
+      </w:pPr>
+    </w:p>
+    <w:p>
+      <w:pPr>
+        <w:pBdr>
+          <w:bottom w:val="single" w:sz="12" w:space="1" w:color="auto"/>
+        </w:pBdr>
+        <w:rPr>
+          <w:b/>
+          <w:bCs/>
+          <w:lang w:val="en-US"/>
+        </w:rPr>
+      </w:pPr>
+      <w:r>
+        <w:rPr>
+          <w:b/>
+          <w:bCs/>
+          <w:lang w:val="en-US"/>
+        </w:rPr>
+        <w:t xml:space="preserve">  </w:t>
+      </w:r>
+      <w:r>
+        <w:rPr>
+          <w:b/>
+          <w:bCs/>
+          <w:highlight w:val="yellow"/>
+          <w:lang w:val="en-US"/>
+        </w:rPr>
+        <w:t>git add &lt;files&gt;</w:t>
+      </w:r>
+    </w:p>
+    <w:p>
+      <w:pPr>
+        <w:pBdr>
+          <w:bottom w:val="single" w:sz="12" w:space="1" w:color="auto"/>
+        </w:pBdr>
+        <w:rPr>
+          <w:b/>
+          <w:bCs/>
+          <w:lang w:val="en-US"/>
+        </w:rPr>
+      </w:pPr>
+      <w:r>
+        <w:rPr>
+          <w:b/>
+          <w:bCs/>
+          <w:lang w:val="en-US"/>
+        </w:rPr>
+        <w:t xml:space="preserve">  </w:t>
+      </w:r>
+      <w:r>
+        <w:rPr>
+          <w:b/>
+          <w:bCs/>
+          <w:highlight w:val="yellow"/>
+          <w:lang w:val="en-US"/>
+        </w:rPr>
+        <w:t>git commit -m "describe what you changed and why"</w:t>
+      </w:r>
+    </w:p>
+    <w:p>
+      <w:pPr>
+        <w:pBdr>
+          <w:bottom w:val="single" w:sz="12" w:space="1" w:color="auto"/>
+        </w:pBdr>
+        <w:rPr>
+          <w:b/>
+          <w:bCs/>
+          <w:lang w:val="en-US"/>
+        </w:rPr>
+      </w:pPr>
+      <w:r>
+        <w:rPr>
+          <w:b/>
+          <w:bCs/>
+          <w:lang w:val="en-US"/>
+        </w:rPr>
+        <w:lastRenderedPageBreak/>
+        <w:t xml:space="preserve">  </w:t>
+      </w:r>
+      <w:r>
+        <w:rPr>
+          <w:b/>
+          <w:bCs/>
+          <w:highlight w:val="yellow"/>
+          <w:lang w:val="en-US"/>
+        </w:rPr>
+        <w:t>git push</w:t>
+      </w:r>
+    </w:p>
+    <w:p>
+      <w:pPr>
         <w:rPr>
           <w:b/>
           <w:bCs/>
@@ -653,7 +1102,6 @@
           <w:bCs/>
           <w:lang w:val="en-US"/>
         </w:rPr>
-        <w:lastRenderedPageBreak/>
         <w:t xml:space="preserve">Take a current layout screenshot after the update and paste it in </w:t>
       </w:r>
       <w:proofErr w:type="spellStart"/>
@@ -855,6 +1303,7 @@
           <w:bCs/>
           <w:lang w:val="en-US"/>
         </w:rPr>
+        <w:lastRenderedPageBreak/>
         <w:t>SubAgentStop</w:t>
       </w:r>
       <w:proofErr w:type="spellEnd"/>
@@ -1050,7 +1499,6 @@
         <w:rPr>
           <w:noProof/>
         </w:rPr>
-        <w:lastRenderedPageBreak/>
         <w:drawing>
           <wp:inline distT="0" distB="0" distL="0" distR="0" wp14:anchorId="04840C53" wp14:editId="6C21F435">
             <wp:extent cx="5943600" cy="4519930"/>
@@ -1151,6 +1599,7 @@
         <w:rPr>
           <w:lang w:val="en-US"/>
         </w:rPr>
+        <w:lastRenderedPageBreak/>
         <w:t xml:space="preserve">CREATE </w:t>
       </w:r>
       <w:r>

</xml_diff>